<commit_message>
Reports: the study_parameters parser strips '*' bullets (every RUV optimisation key kept the bullet, so reports without a record printed 'TRUE% of features (TRUE proteins)'); the trailing % of 'Best percentage' no longer doubled; verified on the real journey's file and renders (KIT-039 follow-up)
</commit_message>
<xml_diff>
--- a/docs/qa/workflow-execution/kit/kit-039/DIANN_report-with-record.docx
+++ b/docs/qa/workflow-execution/kit/kit-039/DIANN_report-with-record.docx
@@ -7,7 +7,7 @@
         <w:pStyle w:val="Title"/>
       </w:pPr>
       <w:r>
-        <w:t xml:space="preserve">DIANN analysis for dia_baseline_smoke - report - created on 2026-10-19 18:48:20</w:t>
+        <w:t xml:space="preserve">DIANN analysis for dia_baseline_smoke - report - created on 2026-10-20 09:53:31</w:t>
       </w:r>
     </w:p>
     <w:p>
@@ -23,7 +23,7 @@
         <w:pStyle w:val="Date"/>
       </w:pPr>
       <w:r>
-        <w:t xml:space="preserve">2026-10-19</w:t>
+        <w:t xml:space="preserve">2026-10-20</w:t>
       </w:r>
     </w:p>
     <w:bookmarkStart w:id="9" w:name="sample-details"/>
@@ -761,7 +761,7 @@
         <w:rPr>
           <w:rStyle w:val="VerbatimChar"/>
         </w:rPr>
-        <w:t xml:space="preserve">## Warning: Composite QC figure not found at /home/doktersmol/.cache/multischolar-kit039-report-screen/dia_baseline_smoke/results_summary/proteomics_dia_baseline_smoke/QC_figures/proteomics_composite_QC_figure.png\n</w:t>
+        <w:t xml:space="preserve">## Warning: Composite QC figure not found at /home/doktersmol/.cache/multischolar-kit039-report-parserfix/dia_baseline_smoke/results_summary/proteomics_dia_baseline_smoke/QC_figures/proteomics_composite_QC_figure.png\n</w:t>
       </w:r>
     </w:p>
     <w:bookmarkEnd w:id="12"/>
@@ -914,7 +914,7 @@
         <w:rPr>
           <w:rStyle w:val="VerbatimChar"/>
         </w:rPr>
-        <w:t xml:space="preserve">## Warning: NumSigDeMolecules directory not found at /home/doktersmol/.cache/multischolar-kit039-report-screen/dia_baseline_smoke/results_summary/proteomics_dia_baseline_smoke/Publication_figures/NumSigDeMolecules</w:t>
+        <w:t xml:space="preserve">## Warning: NumSigDeMolecules directory not found at /home/doktersmol/.cache/multischolar-kit039-report-parserfix/dia_baseline_smoke/results_summary/proteomics_dia_baseline_smoke/Publication_figures/NumSigDeMolecules</w:t>
       </w:r>
     </w:p>
     <w:p>
@@ -937,7 +937,7 @@
         <w:rPr>
           <w:rStyle w:val="VerbatimChar"/>
         </w:rPr>
-        <w:t xml:space="preserve">## Warning: Volcano Plots directory not found at /home/doktersmol/.cache/multischolar-kit039-report-screen/dia_baseline_smoke/results_summary/proteomics_dia_baseline_smoke/Publication_figures/Volcano_Plots\n</w:t>
+        <w:t xml:space="preserve">## Warning: Volcano Plots directory not found at /home/doktersmol/.cache/multischolar-kit039-report-parserfix/dia_baseline_smoke/results_summary/proteomics_dia_baseline_smoke/Publication_figures/Volcano_Plots\n</w:t>
       </w:r>
     </w:p>
     <w:p>
@@ -1268,7 +1268,7 @@
         <w:rPr>
           <w:rStyle w:val="VerbatimChar"/>
         </w:rPr>
-        <w:t xml:space="preserve">## Warning: Enrichment Plots directory not found at /home/doktersmol/.cache/multischolar-kit039-report-screen/dia_baseline_smoke/results_summary/proteomics_dia_baseline_smoke/Publication_figures/Enrichment_Plots\n</w:t>
+        <w:t xml:space="preserve">## Warning: Enrichment Plots directory not found at /home/doktersmol/.cache/multischolar-kit039-report-parserfix/dia_baseline_smoke/results_summary/proteomics_dia_baseline_smoke/Publication_figures/Enrichment_Plots\n</w:t>
       </w:r>
     </w:p>
     <w:p>

</xml_diff>